<commit_message>
Update resume and site copy for graduation
Resume: graduate wording, BullzEye end date, remove Taco Bell, merge
EngineLab into Experience, larger fonts, right-align dates.
Site: student -> graduate, drop internship wording.

Co-Authored-By: Claude Sonnet 5.5 <noreply@anthropic.com>
</commit_message>
<xml_diff>
--- a/public/Darrian_Redford_Resume.docx
+++ b/public/Darrian_Redford_Resume.docx
@@ -13,8 +13,8 @@
           <w:b/>
           <w:bCs/>
           <w:color w:val="1F3864"/>
-          <w:sz w:val="32"/>
-          <w:szCs w:val="32"/>
+          <w:sz w:val="36"/>
+          <w:szCs w:val="36"/>
         </w:rPr>
         <w:t>DARRIAN REDFORD</w:t>
       </w:r>
@@ -41,8 +41,8 @@
         <w:rPr>
           <w:rFonts w:ascii="Calibri" w:eastAsia="Calibri" w:hAnsi="Calibri" w:cs="Calibri"/>
           <w:color w:val="222222"/>
-          <w:sz w:val="18"/>
-          <w:szCs w:val="18"/>
+          <w:sz w:val="20"/>
+          <w:szCs w:val="20"/>
         </w:rPr>
         <w:t>Clearfield, UT  |  801-739-0787  |  darrian.redford04@gmail.com  |  linkedin.com/in/darrian-redford-dev  |  github.com/Xenny76</w:t>
       </w:r>
@@ -60,8 +60,8 @@
           <w:b/>
           <w:bCs/>
           <w:color w:val="1F3864"/>
-          <w:sz w:val="21"/>
-          <w:szCs w:val="21"/>
+          <w:sz w:val="24"/>
+          <w:szCs w:val="24"/>
         </w:rPr>
         <w:t>SUMMARY</w:t>
       </w:r>
@@ -75,7 +75,7 @@
           <w:rFonts w:ascii="Calibri" w:eastAsia="Calibri" w:hAnsi="Calibri" w:cs="Calibri"/>
           <w:color w:val="222222"/>
         </w:rPr>
-        <w:t>Backend-focused Computer Science student (BSCS, Neumont University, 4.0 GPA) with hands-on experience in C#/.NET development, API testing, and client-facing software delivery. Comfortable owning a feature from requirements through documentation, with a track record of writing reliable, well-tested code in production and academic environments. Seeking a software engineering internship or entry-level backend role.</w:t>
+        <w:t>Backend-focused Computer Science graduate (BSCS, Neumont University, 4.0 GPA) with hands-on experience in C#/.NET development, API testing, and client-facing software delivery. Comfortable owning a feature from requirements through documentation, with a track record of writing reliable, well-tested code in production and academic environments. Seeking an entry-level software engineering or backend role.</w:t>
       </w:r>
     </w:p>
     <w:p>
@@ -91,8 +91,8 @@
           <w:b/>
           <w:bCs/>
           <w:color w:val="1F3864"/>
-          <w:sz w:val="21"/>
-          <w:szCs w:val="21"/>
+          <w:sz w:val="24"/>
+          <w:szCs w:val="24"/>
         </w:rPr>
         <w:t>EXPERIENCE</w:t>
       </w:r>
@@ -100,7 +100,7 @@
     <w:p>
       <w:pPr>
         <w:tabs>
-          <w:tab w:val="right" w:pos="9360"/>
+          <w:tab w:val="right" w:pos="10840"/>
         </w:tabs>
         <w:spacing w:before="100"/>
       </w:pPr>
@@ -121,7 +121,7 @@
           <w:color w:val="222222"/>
         </w:rPr>
         <w:tab/>
-        <w:t>Jun 2026 – Present</w:t>
+        <w:t>Jun 2026 – Sep 2026</w:t>
       </w:r>
     </w:p>
     <w:p>
@@ -152,13 +152,13 @@
           <w:rFonts w:ascii="Calibri" w:eastAsia="Calibri" w:hAnsi="Calibri" w:cs="Calibri"/>
           <w:color w:val="222222"/>
         </w:rPr>
-        <w:t>Contributing to backend software development for a golf technology platform as part of a cross-functional engineering team.</w:t>
+        <w:t>Contributed to backend software development for a golf technology platform as part of a cross-functional engineering team.</w:t>
       </w:r>
     </w:p>
     <w:p>
       <w:pPr>
         <w:tabs>
-          <w:tab w:val="right" w:pos="9360"/>
+          <w:tab w:val="right" w:pos="10840"/>
         </w:tabs>
         <w:spacing w:before="100"/>
       </w:pPr>
@@ -267,7 +267,7 @@
     <w:p>
       <w:pPr>
         <w:tabs>
-          <w:tab w:val="right" w:pos="9360"/>
+          <w:tab w:val="right" w:pos="10840"/>
         </w:tabs>
         <w:spacing w:before="100"/>
       </w:pPr>
@@ -359,7 +359,7 @@
     <w:p>
       <w:pPr>
         <w:tabs>
-          <w:tab w:val="right" w:pos="9360"/>
+          <w:tab w:val="right" w:pos="10840"/>
         </w:tabs>
         <w:spacing w:before="100"/>
       </w:pPr>
@@ -370,7 +370,7 @@
           <w:bCs/>
           <w:color w:val="222222"/>
         </w:rPr>
-        <w:t>Team Trainer — Taco Bell</w:t>
+        <w:t>EngineLab — Neumont University Capstone Project</w:t>
       </w:r>
       <w:r>
         <w:rPr>
@@ -380,21 +380,7 @@
           <w:color w:val="222222"/>
         </w:rPr>
         <w:tab/>
-        <w:t>Feb 2021 – Present</w:t>
-      </w:r>
-    </w:p>
-    <w:p>
-      <w:pPr>
-        <w:spacing w:after="40"/>
-      </w:pPr>
-      <w:r>
-        <w:rPr>
-          <w:rFonts w:ascii="Calibri" w:eastAsia="Calibri" w:hAnsi="Calibri" w:cs="Calibri"/>
-          <w:i/>
-          <w:iCs/>
-          <w:color w:val="222222"/>
-        </w:rPr>
-        <w:t>Clearfield, UT</w:t>
+        <w:t>Oct 2025 – Dec 2025</w:t>
       </w:r>
     </w:p>
     <w:p>
@@ -411,53 +397,7 @@
           <w:rFonts w:ascii="Calibri" w:eastAsia="Calibri" w:hAnsi="Calibri" w:cs="Calibri"/>
           <w:color w:val="222222"/>
         </w:rPr>
-        <w:t>Train and onboard team members on operational workflows and store systems, ensuring consistency during peak-volume shifts; diagnose and resolve POS/ordering issues under pressure. Over 5 years of reliable, high-pressure, customer-facing experience alongside coursework and internships.</w:t>
-      </w:r>
-    </w:p>
-    <w:p>
-      <w:pPr>
-        <w:pBdr>
-          <w:bottom w:val="single" w:sz="6" w:space="2" w:color="1F3864"/>
-        </w:pBdr>
-        <w:spacing w:before="180" w:after="60"/>
-      </w:pPr>
-      <w:r>
-        <w:rPr>
-          <w:rFonts w:ascii="Calibri" w:eastAsia="Calibri" w:hAnsi="Calibri" w:cs="Calibri"/>
-          <w:b/>
-          <w:bCs/>
-          <w:color w:val="1F3864"/>
-          <w:sz w:val="21"/>
-          <w:szCs w:val="21"/>
-        </w:rPr>
-        <w:t>PROJECTS</w:t>
-      </w:r>
-    </w:p>
-    <w:p>
-      <w:pPr>
-        <w:tabs>
-          <w:tab w:val="right" w:pos="9360"/>
-        </w:tabs>
-        <w:spacing w:before="100"/>
-      </w:pPr>
-      <w:r>
-        <w:rPr>
-          <w:rFonts w:ascii="Calibri" w:eastAsia="Calibri" w:hAnsi="Calibri" w:cs="Calibri"/>
-          <w:b/>
-          <w:bCs/>
-          <w:color w:val="222222"/>
-        </w:rPr>
-        <w:t>EngineLab — Neumont University Capstone Project</w:t>
-      </w:r>
-      <w:r>
-        <w:rPr>
-          <w:rFonts w:ascii="Calibri" w:eastAsia="Calibri" w:hAnsi="Calibri" w:cs="Calibri"/>
-          <w:i/>
-          <w:iCs/>
-          <w:color w:val="222222"/>
-        </w:rPr>
-        <w:tab/>
-        <w:t>Oct 2025 – Dec 2025</w:t>
+        <w:t>Built a .NET MAUI app in C# that models engine setups from parameterized specifications and outputs simulated performance curves.</w:t>
       </w:r>
     </w:p>
     <w:p>
@@ -474,7 +414,7 @@
           <w:rFonts w:ascii="Calibri" w:eastAsia="Calibri" w:hAnsi="Calibri" w:cs="Calibri"/>
           <w:color w:val="222222"/>
         </w:rPr>
-        <w:t>Built a .NET MAUI app in C# that models engine setups from parameterized specifications and outputs simulated performance curves.</w:t>
+        <w:t>Designed modular simulation logic and structured configuration/presets, with results rendered via ScottPlot for interactive charting and comparisons.</w:t>
       </w:r>
     </w:p>
     <w:p>
@@ -491,23 +431,6 @@
           <w:rFonts w:ascii="Calibri" w:eastAsia="Calibri" w:hAnsi="Calibri" w:cs="Calibri"/>
           <w:color w:val="222222"/>
         </w:rPr>
-        <w:t>Designed modular simulation logic and structured configuration/presets, with results rendered via ScottPlot for interactive charting and comparisons.</w:t>
-      </w:r>
-    </w:p>
-    <w:p>
-      <w:pPr>
-        <w:pStyle w:val="ListParagraph"/>
-        <w:numPr>
-          <w:ilvl w:val="0"/>
-          <w:numId w:val="2"/>
-        </w:numPr>
-        <w:spacing w:after="20"/>
-      </w:pPr>
-      <w:r>
-        <w:rPr>
-          <w:rFonts w:ascii="Calibri" w:eastAsia="Calibri" w:hAnsi="Calibri" w:cs="Calibri"/>
-          <w:color w:val="222222"/>
-        </w:rPr>
         <w:t>github.com/Xenny76/EngineLab</w:t>
       </w:r>
     </w:p>
@@ -524,8 +447,8 @@
           <w:b/>
           <w:bCs/>
           <w:color w:val="1F3864"/>
-          <w:sz w:val="21"/>
-          <w:szCs w:val="21"/>
+          <w:sz w:val="24"/>
+          <w:szCs w:val="24"/>
         </w:rPr>
         <w:t>TECHNICAL SKILLS</w:t>
       </w:r>
@@ -627,8 +550,8 @@
           <w:b/>
           <w:bCs/>
           <w:color w:val="1F3864"/>
-          <w:sz w:val="21"/>
-          <w:szCs w:val="21"/>
+          <w:sz w:val="24"/>
+          <w:szCs w:val="24"/>
         </w:rPr>
         <w:t>EDUCATION</w:t>
       </w:r>
@@ -636,7 +559,7 @@
     <w:p>
       <w:pPr>
         <w:tabs>
-          <w:tab w:val="right" w:pos="9360"/>
+          <w:tab w:val="right" w:pos="10840"/>
         </w:tabs>
         <w:spacing w:before="100"/>
       </w:pPr>
@@ -657,7 +580,7 @@
           <w:color w:val="222222"/>
         </w:rPr>
         <w:tab/>
-        <w:t>Sep 2023 – Sep 2026 (Expected)</w:t>
+        <w:t>Sep 2023 – Sep 2026</w:t>
       </w:r>
     </w:p>
     <w:p>
@@ -669,7 +592,7 @@
           <w:rFonts w:ascii="Calibri" w:eastAsia="Calibri" w:hAnsi="Calibri" w:cs="Calibri"/>
           <w:color w:val="222222"/>
         </w:rPr>
-        <w:t>GPA: 4.0/4.0</w:t>
+        <w:t>GPA: 4.0/4.0 Valedictorian</w:t>
       </w:r>
     </w:p>
     <w:p>
@@ -854,6 +777,8 @@
     <w:rPrDefault>
       <w:rPr>
         <w:rFonts w:ascii="Times New Roman" w:eastAsia="Times New Roman" w:hAnsi="Times New Roman" w:cs="Times New Roman"/>
+        <w:sz w:val="22"/>
+        <w:szCs w:val="22"/>
         <w:lang w:val="en-US" w:eastAsia="en-US" w:bidi="ar-SA"/>
       </w:rPr>
     </w:rPrDefault>

</xml_diff>